<commit_message>
Harden BIOL-1 Fall 2026 course structure
</commit_message>
<xml_diff>
--- a/PUBLISHED/biol-1/ALL_FILES/BIOL-1_Fall-2026_Syllabus.docx
+++ b/PUBLISHED/biol-1/ALL_FILES/BIOL-1_Fall-2026_Syllabus.docx
@@ -228,7 +228,7 @@
         <w:rPr>
           <w:b/>
         </w:rPr>
-        <w:t>Modules 01-15</w:t>
+        <w:t>Modules 01-16</w:t>
       </w:r>
       <w:r>
         <w:t>: module study guides and practice questions.</w:t>
@@ -259,7 +259,7 @@
         <w:t>Practice Tests 01-05</w:t>
       </w:r>
       <w:r>
-        <w:t>: Practice Test 01 covers Modules 1-4; Practice Test 02 covers Modules 5-6; Practice Test 03 covers Modules 7-11; Practice Test 04 covers Modules 12-15; Practice Test 05 is comprehensive review for Modules 1-15.</w:t>
+        <w:t>: Practice Test 01 covers Modules 1-4; Practice Test 02 covers Modules 5-6; Practice Test 03 covers Modules 7-11; Practice Test 04 covers Modules 12-16; Practice Test 05 is comprehensive review for Modules 1-16.</w:t>
       </w:r>
     </w:p>
     <w:p>
@@ -273,7 +273,7 @@
         <w:t>Assessments</w:t>
       </w:r>
       <w:r>
-        <w:t>: Exam 01 covers Modules 1-6; Exam 02 covers Modules 7-11; Exam 03 covers Modules 12-15; the comprehensive final covers Modules 1-15.</w:t>
+        <w:t>: Exam 01 covers Modules 1-6; Exam 02 covers Modules 7-11; Exam 03 covers Modules 12-16; the comprehensive final covers Modules 1-16.</w:t>
       </w:r>
     </w:p>
     <w:p>

</xml_diff>